<commit_message>
Phiếu điều chỉnh kho hàng: sửa số sau khi đã nhập kho mà không phá lịch sử
Chốt theo hướng "điều chỉnh" thay cho "xoá phiếu giao rồi làm lại": xoá là mất
chứng từ xuất kho và dấu vết ai lấy bao nhiêu, mà kế toán cần đúng cái đó.

- goods_moves.kind thêm 'adj': một dòng có dấu (+ tăng, − giảm) gắn vào lô,
  lý do bắt buộc; tồn lô không được âm (hàng đã xuất cho phiếu giao thì không
  thể "chưa từng có"). Chứng từ mới DC_HH.
- POST /api/kho-hang/dieu-chinh — chỉ KT Thu/Chi VC (người kiểm mục II) và Sếp;
  Bãi báo, kế toán ghi.
- Màn Kho hàng: cột Điều chỉnh, nút Điều chỉnh tồn từng lô, sổ hiện dòng
  điều chỉnh kèm lý do.
- Bộ kiểm hai DO thêm bốn bài (Bãi bị từ chối, thiếu lý do, điều chỉnh đúng,
  giảm quá tồn): 9 chỗ từ chối đúng. Tài liệu, README, tệp việc treo ghi luật.

Co-Authored-By: Claude Fable 5.1 <noreply@anthropic.com>
</commit_message>
<xml_diff>
--- a/DOCS/CONG_VIEC_CHO_ANH_KHAMPLA_CHOT.docx
+++ b/DOCS/CONG_VIEC_CHO_ANH_KHAMPLA_CHOT.docx
@@ -516,6 +516,46 @@
             <w:r/>
             <w:r>
               <w:t>Mới: tồn theo từng lô, sổ nhập xuất, bấm một dòng là mở đúng phiếu</w:t>
+            </w:r>
+          </w:p>
+        </w:tc>
+      </w:tr>
+      <w:tr>
+        <w:tc>
+          <w:tcPr>
+            <w:tcW w:type="dxa" w:w="4320"/>
+          </w:tcPr>
+          <w:p>
+            <w:r/>
+            <w:r>
+              <w:t>Sai số sau khi nhập kho</w:t>
+            </w:r>
+          </w:p>
+        </w:tc>
+        <w:tc>
+          <w:tcPr>
+            <w:tcW w:type="dxa" w:w="4320"/>
+          </w:tcPr>
+          <w:p>
+            <w:r/>
+            <w:r>
+              <w:rPr>
+                <w:b/>
+              </w:rPr>
+              <w:t>Phiếu điều chỉnh kho</w:t>
+            </w:r>
+            <w:r>
+              <w:t xml:space="preserve"> (chốt 21/09, thay cho việc xoá phiếu giao rồi làm lại): kế toán ghi một dòng +/− tấn có lý do vào lô, sinh chứng từ </w:t>
+            </w:r>
+            <w:r>
+              <w:rPr>
+                <w:rFonts w:ascii="Consolas" w:hAnsi="Consolas"/>
+                <w:sz w:val="19"/>
+              </w:rPr>
+              <w:t>DC_HH</w:t>
+            </w:r>
+            <w:r>
+              <w:t>, tồn không được âm, lịch sử nhập/xuất giữ nguyên. Phiếu gom đã nhập kho thì dòng hàng và cân đóng lại</w:t>
             </w:r>
           </w:p>
         </w:tc>

</xml_diff>

<commit_message>
Tài liệu: ghi lớp đẩy kế toán vào NGHIEP_VU_DB_API, README, tệp việc treo
Co-Authored-By: Claude Fable 5.1 <noreply@anthropic.com>
</commit_message>
<xml_diff>
--- a/DOCS/CONG_VIEC_CHO_ANH_KHAMPLA_CHOT.docx
+++ b/DOCS/CONG_VIEC_CHO_ANH_KHAMPLA_CHOT.docx
@@ -2598,7 +2598,10 @@
           <w:p>
             <w:r/>
             <w:r>
-              <w:t>API công nợ và sổ kế toán</w:t>
+              <w:rPr>
+                <w:b/>
+              </w:rPr>
+              <w:t>Đường nhận chứng từ</w:t>
             </w:r>
           </w:p>
         </w:tc>
@@ -2620,7 +2623,110 @@
           <w:p>
             <w:r/>
             <w:r>
-              <w:t>Sổ chứng từ đã ghi đủ mọi tờ kèm định khoản gợi ý; nút "đã đẩy" mới đánh dấu, chưa gọi API thật</w:t>
+              <w:rPr>
+                <w:b/>
+              </w:rPr>
+              <w:t>Bên mình đã làm xong lớp đẩy</w:t>
+            </w:r>
+            <w:r>
+              <w:t xml:space="preserve"> (21/09): nút Đẩy, thử lại khi lỗi, chống gửi trùng, Sếp đặt địa chỉ và token trong màn hình. Hợp đồng JSON đề nghị ở </w:t>
+            </w:r>
+            <w:r>
+              <w:rPr>
+                <w:rFonts w:ascii="Consolas" w:hAnsi="Consolas"/>
+                <w:sz w:val="19"/>
+              </w:rPr>
+              <w:t>HOP_DONG_API_ANH_KHANG.md</w:t>
+            </w:r>
+            <w:r>
+              <w:t xml:space="preserve">. Chỉ chờ anh Khang cho địa chỉ + token, và chốt tên đường nếu muốn khác </w:t>
+            </w:r>
+            <w:r>
+              <w:rPr>
+                <w:rFonts w:ascii="Consolas" w:hAnsi="Consolas"/>
+                <w:sz w:val="19"/>
+              </w:rPr>
+              <w:t>/api/v1/epl-lao/vouchers</w:t>
+            </w:r>
+          </w:p>
+        </w:tc>
+      </w:tr>
+      <w:tr>
+        <w:tc>
+          <w:tcPr>
+            <w:tcW w:type="dxa" w:w="2880"/>
+          </w:tcPr>
+          <w:p>
+            <w:r/>
+            <w:r>
+              <w:t>Mã tài khoản còn thiếu (tiền mặt, ngân hàng, hàng khách gửi, giá vốn)</w:t>
+            </w:r>
+          </w:p>
+        </w:tc>
+        <w:tc>
+          <w:tcPr>
+            <w:tcW w:type="dxa" w:w="2880"/>
+          </w:tcPr>
+          <w:p>
+            <w:r/>
+            <w:r>
+              <w:t>Anh Khang</w:t>
+            </w:r>
+          </w:p>
+        </w:tc>
+        <w:tc>
+          <w:tcPr>
+            <w:tcW w:type="dxa" w:w="2880"/>
+          </w:tcPr>
+          <w:p>
+            <w:r/>
+            <w:r>
+              <w:t xml:space="preserve">Đang để tên không mã; sửa một bảng </w:t>
+            </w:r>
+            <w:r>
+              <w:rPr>
+                <w:rFonts w:ascii="Consolas" w:hAnsi="Consolas"/>
+                <w:sz w:val="19"/>
+              </w:rPr>
+              <w:t>services/chung_tu.py</w:t>
+            </w:r>
+            <w:r>
+              <w:t xml:space="preserve"> khi có</w:t>
+            </w:r>
+          </w:p>
+        </w:tc>
+      </w:tr>
+      <w:tr>
+        <w:tc>
+          <w:tcPr>
+            <w:tcW w:type="dxa" w:w="2880"/>
+          </w:tcPr>
+          <w:p>
+            <w:r/>
+            <w:r>
+              <w:t>API công nợ phải thu / phải trả</w:t>
+            </w:r>
+          </w:p>
+        </w:tc>
+        <w:tc>
+          <w:tcPr>
+            <w:tcW w:type="dxa" w:w="2880"/>
+          </w:tcPr>
+          <w:p>
+            <w:r/>
+            <w:r>
+              <w:t>Anh Khang</w:t>
+            </w:r>
+          </w:p>
+        </w:tc>
+        <w:tc>
+          <w:tcPr>
+            <w:tcW w:type="dxa" w:w="2880"/>
+          </w:tcPr>
+          <w:p>
+            <w:r/>
+            <w:r>
+              <w:t>Chưa làm; chỉ đọc và hiện nếu anh có đường sẵn</w:t>
             </w:r>
           </w:p>
         </w:tc>

</xml_diff>